<commit_message>
TechRetail como tienda de tecnología: modo cliente y modo empleado
- TechRetail pasa a ser una tienda de tecnología (web, Mercado Libre y local):
  20 documentos en 8 formatos, con la información para clientes en su propia
  categoría. Se quita la tienda de ejemplo Nogal
- Modo cliente (sin sesión): RAG directo sólo sobre las categorías públicas;
  el filtro lo aplica la base vectorial. Modo empleado: documentos internos y
  el agente con Mercado Libre. En la demo se entra con un botón (EMPLEADO_DEMO)
- Cuota de la API: el tope diario cuenta llamadas al modelo, las respuestas a
  las preguntas sugeridas se guardan y, si se agota la cuota, se avisa (con el
  video de la demo si está configurado)
- Si el modelo responde que no encontró la información, no se citan fuentes
- Evaluación de recuperación por público, con aislamiento de documentos
  internos; README con los resultados medidos contra Gemini
</commit_message>
<xml_diff>
--- a/perfiles/techretail/documentos/operacional/procedimiento_conciliacion.docx
+++ b/perfiles/techretail/documentos/operacional/procedimiento_conciliacion.docx
@@ -7,12 +7,12 @@
         <w:pStyle w:val="Heading1"/>
       </w:pPr>
       <w:r>
-        <w:t>Procedimiento de Conciliación Financiera — TechRetail</w:t>
+        <w:t>Procedimiento de conciliación de cobros - TechRetail</w:t>
       </w:r>
     </w:p>
     <w:p>
       <w:r>
-        <w:t>Describe cómo el Motor de Conciliación Automatizado cruza los cobros de las pasarelas contra las órdenes de venta.</w:t>
+        <w:t>Uso interno. Describe cómo se controla todos los días que lo que liquidan Mercado Pago y Mercado Libre coincida con las ventas registradas.</w:t>
       </w:r>
     </w:p>
     <w:p>
@@ -25,22 +25,22 @@
     </w:p>
     <w:p>
       <w:r>
-        <w:t>1. La pasarela envía un webhook por cada cobro acreditado.</w:t>
+        <w:t>1. Cada mañana, Administración descarga las liquidaciones del día anterior de Mercado Pago y de Mercado Libre.</w:t>
       </w:r>
     </w:p>
     <w:p>
       <w:r>
-        <w:t>2. El motor cruza el monto neto depositado contra la orden, aplicando la matriz de comisiones configurada por pasarela y medio de pago.</w:t>
+        <w:t>2. Se cruzan contra las ventas del sistema de gestión, descontando las comisiones de la tabla de comisiones vigente.</w:t>
       </w:r>
     </w:p>
     <w:p>
       <w:r>
-        <w:t>3. Toda orden con una diferencia superior al 0,1% se aísla en el panel de discrepancias para su resolución inmediata.</w:t>
+        <w:t>3. Toda venta con una diferencia mayor al 0,5 % entre lo esperado y lo liquidado se marca como discrepancia y se revisa en el día.</w:t>
       </w:r>
     </w:p>
     <w:p>
       <w:r>
-        <w:t>El objetivo es eliminar la discrepancia estructural del 2% que existía con la conciliación manual quincenal en Excel.</w:t>
+        <w:t>4. Las devoluciones y los contracargos se registran aparte y se informan al encargado de postventa.</w:t>
       </w:r>
     </w:p>
     <w:sectPr>

</xml_diff>